<commit_message>
Add interview proof photos, bedside sketches, field notes, and app screenshot into formal report documents
</commit_message>
<xml_diff>
--- a/MedSkill_AI_Design_Thinking_Report.docx
+++ b/MedSkill_AI_Design_Thinking_Report.docx
@@ -2011,16 +2011,264 @@
     <w:p>
       <w:pPr>
         <w:pStyle w:val="Heading2"/>
+      </w:pPr>
+      <w:r>
+        <w:t>4.2 Field Research Evidence and Stakeholder Interaction</w:t>
+      </w:r>
+    </w:p>
+    <w:p>
+      <w:r>
+        <w:t>Direct observational studies and interviews were conducted on-site with undergraduate student stakeholders (Riddhi, Siddhi, Naziya, Preethi, Bhargav, Naveen, Tharun, and Atharv). Figure 4.1 and Figure 4.2 capture in-person interview sessions exploring clinical viva anxiety and ward obstacles. Figure 4.3 illustrates bedside technical drawings of ventilator circuit connections and transport oxygen cylinders, while Figure 4.4 reproduces authentic handwritten field notes documenting floor hazards, including humidifier dry-outs, ETT migration, and dialyzer clotting.</w:t>
+      </w:r>
+    </w:p>
+    <w:p/>
+    <w:tbl>
+      <w:tblPr>
+        <w:tblW w:type="auto" w:w="0"/>
+        <w:jc w:val="center"/>
+        <w:tblLayout w:type="fixed"/>
+        <w:tblLook w:firstColumn="1" w:firstRow="1" w:lastColumn="0" w:lastRow="0" w:noHBand="0" w:noVBand="1" w:val="04A0"/>
+      </w:tblPr>
+      <w:tblGrid>
+        <w:gridCol w:w="4680"/>
+        <w:gridCol w:w="4680"/>
+      </w:tblGrid>
+      <w:tr>
+        <w:tc>
+          <w:tcPr>
+            <w:tcW w:type="dxa" w:w="4608"/>
+          </w:tcPr>
+          <w:p>
+            <w:pPr>
+              <w:jc w:val="center"/>
+            </w:pPr>
+            <w:r>
+              <w:drawing>
+                <wp:inline xmlns:a="http://schemas.openxmlformats.org/drawingml/2006/main" xmlns:pic="http://schemas.openxmlformats.org/drawingml/2006/picture">
+                  <wp:extent cx="2743200" cy="2057400"/>
+                  <wp:docPr id="1" name="Picture 1"/>
+                  <wp:cNvGraphicFramePr>
+                    <a:graphicFrameLocks noChangeAspect="1"/>
+                  </wp:cNvGraphicFramePr>
+                  <a:graphic>
+                    <a:graphicData uri="http://schemas.openxmlformats.org/drawingml/2006/picture">
+                      <pic:pic>
+                        <pic:nvPicPr>
+                          <pic:cNvPr id="0" name="interview_photo_1.jpg"/>
+                          <pic:cNvPicPr/>
+                        </pic:nvPicPr>
+                        <pic:blipFill>
+                          <a:blip r:embed="rId11"/>
+                          <a:stretch>
+                            <a:fillRect/>
+                          </a:stretch>
+                        </pic:blipFill>
+                        <pic:spPr>
+                          <a:xfrm>
+                            <a:off x="0" y="0"/>
+                            <a:ext cx="2743200" cy="2057400"/>
+                          </a:xfrm>
+                          <a:prstGeom prst="rect"/>
+                        </pic:spPr>
+                      </pic:pic>
+                    </a:graphicData>
+                  </a:graphic>
+                </wp:inline>
+              </w:drawing>
+            </w:r>
+          </w:p>
+          <w:p>
+            <w:pPr>
+              <w:jc w:val="center"/>
+            </w:pPr>
+            <w:r>
+              <w:rPr>
+                <w:i/>
+                <w:sz w:val="17"/>
+              </w:rPr>
+              <w:t>Figure 4.1: Live Empathy Interview with Respiratory Student Stakeholder.</w:t>
+            </w:r>
+          </w:p>
+        </w:tc>
+        <w:tc>
+          <w:tcPr>
+            <w:tcW w:type="dxa" w:w="4608"/>
+          </w:tcPr>
+          <w:p>
+            <w:pPr>
+              <w:jc w:val="center"/>
+            </w:pPr>
+            <w:r>
+              <w:drawing>
+                <wp:inline xmlns:a="http://schemas.openxmlformats.org/drawingml/2006/main" xmlns:pic="http://schemas.openxmlformats.org/drawingml/2006/picture">
+                  <wp:extent cx="2743200" cy="2057400"/>
+                  <wp:docPr id="2" name="Picture 2"/>
+                  <wp:cNvGraphicFramePr>
+                    <a:graphicFrameLocks noChangeAspect="1"/>
+                  </wp:cNvGraphicFramePr>
+                  <a:graphic>
+                    <a:graphicData uri="http://schemas.openxmlformats.org/drawingml/2006/picture">
+                      <pic:pic>
+                        <pic:nvPicPr>
+                          <pic:cNvPr id="0" name="interview_photo_2.jpg"/>
+                          <pic:cNvPicPr/>
+                        </pic:nvPicPr>
+                        <pic:blipFill>
+                          <a:blip r:embed="rId12"/>
+                          <a:stretch>
+                            <a:fillRect/>
+                          </a:stretch>
+                        </pic:blipFill>
+                        <pic:spPr>
+                          <a:xfrm>
+                            <a:off x="0" y="0"/>
+                            <a:ext cx="2743200" cy="2057400"/>
+                          </a:xfrm>
+                          <a:prstGeom prst="rect"/>
+                        </pic:spPr>
+                      </pic:pic>
+                    </a:graphicData>
+                  </a:graphic>
+                </wp:inline>
+              </w:drawing>
+            </w:r>
+          </w:p>
+          <w:p>
+            <w:pPr>
+              <w:jc w:val="center"/>
+            </w:pPr>
+            <w:r>
+              <w:rPr>
+                <w:i/>
+                <w:sz w:val="17"/>
+              </w:rPr>
+              <w:t>Figure 4.2: Investigation of Passive Revision and Bedside Viva Triggers.</w:t>
+            </w:r>
+          </w:p>
+        </w:tc>
+      </w:tr>
+      <w:tr>
+        <w:tc>
+          <w:tcPr>
+            <w:tcW w:type="dxa" w:w="4608"/>
+          </w:tcPr>
+          <w:p>
+            <w:pPr>
+              <w:jc w:val="center"/>
+            </w:pPr>
+            <w:r>
+              <w:drawing>
+                <wp:inline xmlns:a="http://schemas.openxmlformats.org/drawingml/2006/main" xmlns:pic="http://schemas.openxmlformats.org/drawingml/2006/picture">
+                  <wp:extent cx="2286000" cy="3048000"/>
+                  <wp:docPr id="3" name="Picture 3"/>
+                  <wp:cNvGraphicFramePr>
+                    <a:graphicFrameLocks noChangeAspect="1"/>
+                  </wp:cNvGraphicFramePr>
+                  <a:graphic>
+                    <a:graphicData uri="http://schemas.openxmlformats.org/drawingml/2006/picture">
+                      <pic:pic>
+                        <pic:nvPicPr>
+                          <pic:cNvPr id="0" name="hand_sketch_notes.jpg"/>
+                          <pic:cNvPicPr/>
+                        </pic:nvPicPr>
+                        <pic:blipFill>
+                          <a:blip r:embed="rId13"/>
+                          <a:stretch>
+                            <a:fillRect/>
+                          </a:stretch>
+                        </pic:blipFill>
+                        <pic:spPr>
+                          <a:xfrm>
+                            <a:off x="0" y="0"/>
+                            <a:ext cx="2286000" cy="3048000"/>
+                          </a:xfrm>
+                          <a:prstGeom prst="rect"/>
+                        </pic:spPr>
+                      </pic:pic>
+                    </a:graphicData>
+                  </a:graphic>
+                </wp:inline>
+              </w:drawing>
+            </w:r>
+          </w:p>
+          <w:p>
+            <w:pPr>
+              <w:jc w:val="center"/>
+            </w:pPr>
+            <w:r>
+              <w:rPr>
+                <w:i/>
+                <w:sz w:val="17"/>
+              </w:rPr>
+              <w:t>Figure 4.3: Bedside Sketches: Humidifier Bottle &amp; Transport Cylinder Problems.</w:t>
+            </w:r>
+          </w:p>
+        </w:tc>
+        <w:tc>
+          <w:tcPr>
+            <w:tcW w:type="dxa" w:w="4608"/>
+          </w:tcPr>
+          <w:p>
+            <w:pPr>
+              <w:jc w:val="center"/>
+            </w:pPr>
+            <w:r>
+              <w:drawing>
+                <wp:inline xmlns:a="http://schemas.openxmlformats.org/drawingml/2006/main" xmlns:pic="http://schemas.openxmlformats.org/drawingml/2006/picture">
+                  <wp:extent cx="2286000" cy="3048000"/>
+                  <wp:docPr id="4" name="Picture 4"/>
+                  <wp:cNvGraphicFramePr>
+                    <a:graphicFrameLocks noChangeAspect="1"/>
+                  </wp:cNvGraphicFramePr>
+                  <a:graphic>
+                    <a:graphicData uri="http://schemas.openxmlformats.org/drawingml/2006/picture">
+                      <pic:pic>
+                        <pic:nvPicPr>
+                          <pic:cNvPr id="0" name="interview_written_notes.png"/>
+                          <pic:cNvPicPr/>
+                        </pic:nvPicPr>
+                        <pic:blipFill>
+                          <a:blip r:embed="rId14"/>
+                          <a:stretch>
+                            <a:fillRect/>
+                          </a:stretch>
+                        </pic:blipFill>
+                        <pic:spPr>
+                          <a:xfrm>
+                            <a:off x="0" y="0"/>
+                            <a:ext cx="2286000" cy="3048000"/>
+                          </a:xfrm>
+                          <a:prstGeom prst="rect"/>
+                        </pic:spPr>
+                      </pic:pic>
+                    </a:graphicData>
+                  </a:graphic>
+                </wp:inline>
+              </w:drawing>
+            </w:r>
+          </w:p>
+          <w:p>
+            <w:pPr>
+              <w:jc w:val="center"/>
+            </w:pPr>
+            <w:r>
+              <w:rPr>
+                <w:i/>
+                <w:sz w:val="17"/>
+              </w:rPr>
+              <w:t>Figure 4.4: Authentic Field Notes: 25 Clinical ICU and OT Floor Hazards.</w:t>
+            </w:r>
+          </w:p>
+        </w:tc>
+      </w:tr>
+    </w:tbl>
+    <w:p>
+      <w:pPr>
+        <w:pStyle w:val="Heading2"/>
         <w:spacing w:before="280" w:after="120"/>
       </w:pPr>
       <w:r>
-        <w:rPr>
-          <w:rFonts w:ascii="Times New Roman" w:hAnsi="Times New Roman"/>
-          <w:b/>
-          <w:color w:val="1E293B"/>
-          <w:sz w:val="28"/>
-        </w:rPr>
-        <w:t>4.2 Inventory of 25 Real Clinical Problems Discovered</w:t>
+        <w:t>4.3 Inventory of 25 Real Clinical Problems Discovered</w:t>
       </w:r>
     </w:p>
     <w:p>
@@ -2675,6 +2923,62 @@
           <w:sz w:val="24"/>
         </w:rPr>
         <w:t>The core educational asset is an expanded curriculum question bank containing exactly 12 questions for each of the 12 core topics across the three target specialties (144 questions total). Each entry contains a unique alphanumeric identifier, specialty, topic, difficulty tier (Beginner, Intermediate, Advanced), four balanced options, a verified answer key, a detailed clinical explanation, bulleted revision talking points, and an instructor-approved sample oral viva response.</w:t>
+      </w:r>
+    </w:p>
+    <w:p>
+      <w:r>
+        <w:t>The deployed web application interface (accessible at https://medskill-ai.streamlit.app/) is depicted in Figure 8.1. The design enforces a crisp, academic high-contrast visual architecture ensuring full legibility across both mobile and desktop viewport resolutions. It incorporates active clinical simulation timers, curriculum specialty selectors, and immediate transparent answer feedback.</w:t>
+      </w:r>
+    </w:p>
+    <w:p>
+      <w:pPr>
+        <w:jc w:val="center"/>
+      </w:pPr>
+      <w:r>
+        <w:drawing>
+          <wp:inline xmlns:a="http://schemas.openxmlformats.org/drawingml/2006/main" xmlns:pic="http://schemas.openxmlformats.org/drawingml/2006/picture">
+            <wp:extent cx="5029200" cy="2966442"/>
+            <wp:docPr id="5" name="Picture 5"/>
+            <wp:cNvGraphicFramePr>
+              <a:graphicFrameLocks noChangeAspect="1"/>
+            </wp:cNvGraphicFramePr>
+            <a:graphic>
+              <a:graphicData uri="http://schemas.openxmlformats.org/drawingml/2006/picture">
+                <pic:pic>
+                  <pic:nvPicPr>
+                    <pic:cNvPr id="0" name="app_screenshot.png"/>
+                    <pic:cNvPicPr/>
+                  </pic:nvPicPr>
+                  <pic:blipFill>
+                    <a:blip r:embed="rId15"/>
+                    <a:stretch>
+                      <a:fillRect/>
+                    </a:stretch>
+                  </pic:blipFill>
+                  <pic:spPr>
+                    <a:xfrm>
+                      <a:off x="0" y="0"/>
+                      <a:ext cx="5029200" cy="2966442"/>
+                    </a:xfrm>
+                    <a:prstGeom prst="rect"/>
+                  </pic:spPr>
+                </pic:pic>
+              </a:graphicData>
+            </a:graphic>
+          </wp:inline>
+        </w:drawing>
+      </w:r>
+    </w:p>
+    <w:p>
+      <w:pPr>
+        <w:jc w:val="center"/>
+      </w:pPr>
+      <w:r>
+        <w:rPr>
+          <w:i/>
+          <w:sz w:val="18"/>
+        </w:rPr>
+        <w:t>Figure 8.1: Live MedSkill AI Web Interface with High-Contrast Typography &amp; Specialty Navigation.</w:t>
       </w:r>
     </w:p>
     <w:p>

</xml_diff>